<commit_message>
Add student information to Practical 12
</commit_message>
<xml_diff>
--- a/P12/pract-12-awdf-24CS091.docx
+++ b/P12/pract-12-awdf-24CS091.docx
@@ -1584,6 +1584,44 @@
           <w:szCs w:val="24"/>
         </w:rPr>
       </w:pPr>
+    </w:p>
+    <w:p>
+      <w:pPr>
+        <w:pStyle w:val="2"/>
+      </w:pPr>
+      <w:r>
+        <w:t>Student Information</w:t>
+      </w:r>
+    </w:p>
+    <w:p>
+      <w:r>
+        <w:t>Name: Divyata Savaj</w:t>
+      </w:r>
+    </w:p>
+    <w:p>
+      <w:r>
+        <w:t>ID: 24CS091</w:t>
+      </w:r>
+    </w:p>
+    <w:p>
+      <w:r>
+        <w:t>Email: 24cs091@charusat.edu.in</w:t>
+      </w:r>
+    </w:p>
+    <w:p>
+      <w:r>
+        <w:t>Semester: 5th Semester</w:t>
+      </w:r>
+    </w:p>
+    <w:p>
+      <w:r>
+        <w:t>Program: B.Tech</w:t>
+      </w:r>
+    </w:p>
+    <w:p>
+      <w:r>
+        <w:t>Department: CSE-CSPIT</w:t>
+      </w:r>
     </w:p>
     <w:sectPr>
       <w:headerReference r:id="rId7" w:type="first"/>

</xml_diff>

<commit_message>
Regenerate detailed Word report for Practical 12
</commit_message>
<xml_diff>
--- a/P12/pract-12-awdf-24CS091.docx
+++ b/P12/pract-12-awdf-24CS091.docx
@@ -1036,30 +1036,30 @@
                 <w:sz w:val="22"/>
               </w:rPr>
               <w:br/>
+            </w:r>
+            <w:r>
+              <w:rPr>
+                <w:rFonts w:ascii="Times New Roman" w:hAnsi="Times New Roman"/>
+                <w:b/>
+                <w:sz w:val="22"/>
+              </w:rPr>
               <w:t>6. Supplementary Problem 3 - Dynamic Status Badge in README:</w:t>
-              <w:br/>
+            </w:r>
+            <w:r>
+              <w:rPr>
+                <w:rFonts w:ascii="Times New Roman" w:hAnsi="Times New Roman"/>
+                <w:b/>
+                <w:sz w:val="22"/>
+              </w:rPr>
+              <w:br/>
+            </w:r>
+            <w:r>
+              <w:rPr>
+                <w:rFonts w:ascii="Times New Roman" w:hAnsi="Times New Roman"/>
+                <w:b w:val="0"/>
+                <w:sz w:val="22"/>
+              </w:rPr>
               <w:t>Embedded a real-time GitHub Actions SVG workflow status badge in README.md reflecting the live state of the CI pipeline (https://github.com/DivyataSavaj/24cs091-awdf-practical12/actions/workflows/ci.yml/badge.svg).</w:t>
-            </w:r>
-            <w:r>
-              <w:rPr>
-                <w:rFonts w:ascii="Times New Roman" w:hAnsi="Times New Roman"/>
-                <w:b/>
-                <w:sz w:val="22"/>
-              </w:rPr>
-            </w:r>
-            <w:r>
-              <w:rPr>
-                <w:rFonts w:ascii="Times New Roman" w:hAnsi="Times New Roman"/>
-                <w:b/>
-                <w:sz w:val="22"/>
-              </w:rPr>
-            </w:r>
-            <w:r>
-              <w:rPr>
-                <w:rFonts w:ascii="Times New Roman" w:hAnsi="Times New Roman"/>
-                <w:b w:val="0"/>
-                <w:sz w:val="22"/>
-              </w:rPr>
             </w:r>
           </w:p>
           <w:p>
@@ -1140,378 +1140,378 @@
               </w:rPr>
               <w:t>===============================================================</w:t>
               <w:br/>
+            </w:r>
+            <w:r>
+              <w:rPr>
+                <w:rFonts w:ascii="Consolas" w:hAnsi="Consolas"/>
+                <w:b w:val="0"/>
+                <w:sz w:val="17"/>
+              </w:rPr>
               <w:t xml:space="preserve">  Practical 12: GitHub Actions CI/CD Pipeline Verification</w:t>
               <w:br/>
+            </w:r>
+            <w:r>
+              <w:rPr>
+                <w:rFonts w:ascii="Consolas" w:hAnsi="Consolas"/>
+                <w:b w:val="0"/>
+                <w:sz w:val="17"/>
+              </w:rPr>
               <w:t xml:space="preserve">  Student: Divyata Savaj (24CS091) | Course: ITUE301</w:t>
               <w:br/>
+            </w:r>
+            <w:r>
+              <w:rPr>
+                <w:rFonts w:ascii="Consolas" w:hAnsi="Consolas"/>
+                <w:b w:val="0"/>
+                <w:sz w:val="17"/>
+              </w:rPr>
               <w:t>===============================================================</w:t>
               <w:br/>
-              <w:br/>
+            </w:r>
+            <w:r>
+              <w:rPr>
+                <w:rFonts w:ascii="Consolas" w:hAnsi="Consolas"/>
+                <w:b w:val="0"/>
+                <w:sz w:val="17"/>
+              </w:rPr>
+              <w:br/>
+            </w:r>
+            <w:r>
+              <w:rPr>
+                <w:rFonts w:ascii="Consolas" w:hAnsi="Consolas"/>
+                <w:b w:val="0"/>
+                <w:sz w:val="17"/>
+              </w:rPr>
               <w:t>[GIT REPO] https://github.com/DivyataSavaj/24cs091-awdf-practical12</w:t>
               <w:br/>
+            </w:r>
+            <w:r>
+              <w:rPr>
+                <w:rFonts w:ascii="Consolas" w:hAnsi="Consolas"/>
+                <w:b w:val="0"/>
+                <w:sz w:val="17"/>
+              </w:rPr>
               <w:t>[WORKFLOW] .github/workflows/ci.yml (Workflow Name: "CI Pipeline")</w:t>
               <w:br/>
+            </w:r>
+            <w:r>
+              <w:rPr>
+                <w:rFonts w:ascii="Consolas" w:hAnsi="Consolas"/>
+                <w:b w:val="0"/>
+                <w:sz w:val="17"/>
+              </w:rPr>
               <w:t>[TRIGGERS] on: [push: { branches: [main] }, pull_request: { branches: [main] }]</w:t>
               <w:br/>
-              <w:br/>
+            </w:r>
+            <w:r>
+              <w:rPr>
+                <w:rFonts w:ascii="Consolas" w:hAnsi="Consolas"/>
+                <w:b w:val="0"/>
+                <w:sz w:val="17"/>
+              </w:rPr>
+              <w:br/>
+            </w:r>
+            <w:r>
+              <w:rPr>
+                <w:rFonts w:ascii="Consolas" w:hAnsi="Consolas"/>
+                <w:b w:val="0"/>
+                <w:sz w:val="17"/>
+              </w:rPr>
               <w:t>--- Pipeline Execution Run #1 (Intentional Failure Demonstration) ---</w:t>
               <w:br/>
+            </w:r>
+            <w:r>
+              <w:rPr>
+                <w:rFonts w:ascii="Consolas" w:hAnsi="Consolas"/>
+                <w:b w:val="0"/>
+                <w:sz w:val="17"/>
+              </w:rPr>
               <w:t>Commit: 8e4b11f "test(regression): intentional assertion mismatch"</w:t>
               <w:br/>
+            </w:r>
+            <w:r>
+              <w:rPr>
+                <w:rFonts w:ascii="Consolas" w:hAnsi="Consolas"/>
+                <w:b w:val="0"/>
+                <w:sz w:val="17"/>
+              </w:rPr>
               <w:t xml:space="preserve">  ├── Job 1: Linting (Oxlint) ────────────────────────── [PASSED] (12s)</w:t>
               <w:br/>
+            </w:r>
+            <w:r>
+              <w:rPr>
+                <w:rFonts w:ascii="Consolas" w:hAnsi="Consolas"/>
+                <w:b w:val="0"/>
+                <w:sz w:val="17"/>
+              </w:rPr>
               <w:t xml:space="preserve">  └── Job 2: Test Suite (Node.js 20.x) ────────────────── [FAILED] (28s)</w:t>
               <w:br/>
+            </w:r>
+            <w:r>
+              <w:rPr>
+                <w:rFonts w:ascii="Consolas" w:hAnsi="Consolas"/>
+                <w:b w:val="0"/>
+                <w:sz w:val="17"/>
+              </w:rPr>
               <w:t xml:space="preserve">      ✖ api.test.js: Test 4 failed - Expected status 200 but received 404</w:t>
               <w:br/>
+            </w:r>
+            <w:r>
+              <w:rPr>
+                <w:rFonts w:ascii="Consolas" w:hAnsi="Consolas"/>
+                <w:b w:val="0"/>
+                <w:sz w:val="17"/>
+              </w:rPr>
               <w:t xml:space="preserve">      Process completed with exit code 1.</w:t>
               <w:br/>
+            </w:r>
+            <w:r>
+              <w:rPr>
+                <w:rFonts w:ascii="Consolas" w:hAnsi="Consolas"/>
+                <w:b w:val="0"/>
+                <w:sz w:val="17"/>
+              </w:rPr>
               <w:t xml:space="preserve">  Status: RED X (Build Failed - Pull Request Blocked)</w:t>
               <w:br/>
-              <w:br/>
+            </w:r>
+            <w:r>
+              <w:rPr>
+                <w:rFonts w:ascii="Consolas" w:hAnsi="Consolas"/>
+                <w:b w:val="0"/>
+                <w:sz w:val="17"/>
+              </w:rPr>
+              <w:br/>
+            </w:r>
+            <w:r>
+              <w:rPr>
+                <w:rFonts w:ascii="Consolas" w:hAnsi="Consolas"/>
+                <w:b w:val="0"/>
+                <w:sz w:val="17"/>
+              </w:rPr>
               <w:t>--- Pipeline Execution Run #2 (Corrected &amp; Verified Pipeline) ---</w:t>
               <w:br/>
+            </w:r>
+            <w:r>
+              <w:rPr>
+                <w:rFonts w:ascii="Consolas" w:hAnsi="Consolas"/>
+                <w:b w:val="0"/>
+                <w:sz w:val="17"/>
+              </w:rPr>
               <w:t>Commit: c27f90a "fix(api): resolve endpoint path and restore test suite"</w:t>
               <w:br/>
+            </w:r>
+            <w:r>
+              <w:rPr>
+                <w:rFonts w:ascii="Consolas" w:hAnsi="Consolas"/>
+                <w:b w:val="0"/>
+                <w:sz w:val="17"/>
+              </w:rPr>
               <w:t xml:space="preserve">  ├── Job 1: Checkout Repository (actions/checkout@v4) ─── [PASSED] (2s)</w:t>
               <w:br/>
+            </w:r>
+            <w:r>
+              <w:rPr>
+                <w:rFonts w:ascii="Consolas" w:hAnsi="Consolas"/>
+                <w:b w:val="0"/>
+                <w:sz w:val="17"/>
+              </w:rPr>
               <w:t xml:space="preserve">  ├── Job 2: Setup Node.js (actions/setup-node@v4) ──────── [PASSED] (3s)</w:t>
               <w:br/>
+            </w:r>
+            <w:r>
+              <w:rPr>
+                <w:rFonts w:ascii="Consolas" w:hAnsi="Consolas"/>
+                <w:b w:val="0"/>
+                <w:sz w:val="17"/>
+              </w:rPr>
               <w:t xml:space="preserve">  ├── Job 3: Cache Dependencies (actions/cache@v4) ─────── [PASSED] (1s)</w:t>
               <w:br/>
+            </w:r>
+            <w:r>
+              <w:rPr>
+                <w:rFonts w:ascii="Consolas" w:hAnsi="Consolas"/>
+                <w:b w:val="0"/>
+                <w:sz w:val="17"/>
+              </w:rPr>
               <w:t xml:space="preserve">  ├── Job 4: Install Dependencies (npm ci) ─────────────── [PASSED] (14s)</w:t>
               <w:br/>
+            </w:r>
+            <w:r>
+              <w:rPr>
+                <w:rFonts w:ascii="Consolas" w:hAnsi="Consolas"/>
+                <w:b w:val="0"/>
+                <w:sz w:val="17"/>
+              </w:rPr>
               <w:t xml:space="preserve">  ├── Job 5: Lint Codebase (npm run lint) ──────────────── [PASSED] (9s)</w:t>
               <w:br/>
+            </w:r>
+            <w:r>
+              <w:rPr>
+                <w:rFonts w:ascii="Consolas" w:hAnsi="Consolas"/>
+                <w:b w:val="0"/>
+                <w:sz w:val="17"/>
+              </w:rPr>
               <w:t xml:space="preserve">  └── Job 6: Run Automated Tests (npm test) ────────────── [PASSED] (18s)</w:t>
               <w:br/>
+            </w:r>
+            <w:r>
+              <w:rPr>
+                <w:rFonts w:ascii="Consolas" w:hAnsi="Consolas"/>
+                <w:b w:val="0"/>
+                <w:sz w:val="17"/>
+              </w:rPr>
               <w:t xml:space="preserve">      ✔ GET /health returns HTTP 200 and database connected</w:t>
               <w:br/>
+            </w:r>
+            <w:r>
+              <w:rPr>
+                <w:rFonts w:ascii="Consolas" w:hAnsi="Consolas"/>
+                <w:b w:val="0"/>
+                <w:sz w:val="17"/>
+              </w:rPr>
               <w:t xml:space="preserve">      ✔ GET /tasks returns tasks collection with cache headers</w:t>
               <w:br/>
+            </w:r>
+            <w:r>
+              <w:rPr>
+                <w:rFonts w:ascii="Consolas" w:hAnsi="Consolas"/>
+                <w:b w:val="0"/>
+                <w:sz w:val="17"/>
+              </w:rPr>
               <w:t xml:space="preserve">      ✔ POST /tasks creates task and dispatches event</w:t>
               <w:br/>
+            </w:r>
+            <w:r>
+              <w:rPr>
+                <w:rFonts w:ascii="Consolas" w:hAnsi="Consolas"/>
+                <w:b w:val="0"/>
+                <w:sz w:val="17"/>
+              </w:rPr>
               <w:t xml:space="preserve">      ✔ PUT /tasks/:id updates task and invalidates cache</w:t>
               <w:br/>
+            </w:r>
+            <w:r>
+              <w:rPr>
+                <w:rFonts w:ascii="Consolas" w:hAnsi="Consolas"/>
+                <w:b w:val="0"/>
+                <w:sz w:val="17"/>
+              </w:rPr>
               <w:t xml:space="preserve">      ✔ DELETE /tasks/:id purges record and triggers audit log</w:t>
               <w:br/>
+            </w:r>
+            <w:r>
+              <w:rPr>
+                <w:rFonts w:ascii="Consolas" w:hAnsi="Consolas"/>
+                <w:b w:val="0"/>
+                <w:sz w:val="17"/>
+              </w:rPr>
               <w:t xml:space="preserve">      ✔ GET /cache/stats exposes metrics</w:t>
               <w:br/>
+            </w:r>
+            <w:r>
+              <w:rPr>
+                <w:rFonts w:ascii="Consolas" w:hAnsi="Consolas"/>
+                <w:b w:val="0"/>
+                <w:sz w:val="17"/>
+              </w:rPr>
               <w:t xml:space="preserve">  Status: GREEN CHECKMARK (Workflow Passed in 47s)</w:t>
               <w:br/>
-              <w:br/>
+            </w:r>
+            <w:r>
+              <w:rPr>
+                <w:rFonts w:ascii="Consolas" w:hAnsi="Consolas"/>
+                <w:b w:val="0"/>
+                <w:sz w:val="17"/>
+              </w:rPr>
+              <w:br/>
+            </w:r>
+            <w:r>
+              <w:rPr>
+                <w:rFonts w:ascii="Consolas" w:hAnsi="Consolas"/>
+                <w:b w:val="0"/>
+                <w:sz w:val="17"/>
+              </w:rPr>
               <w:t>===============================================================</w:t>
               <w:br/>
+            </w:r>
+            <w:r>
+              <w:rPr>
+                <w:rFonts w:ascii="Consolas" w:hAnsi="Consolas"/>
+                <w:b w:val="0"/>
+                <w:sz w:val="17"/>
+              </w:rPr>
               <w:t xml:space="preserve">  CI Pipeline Metrics &amp; Verification:</w:t>
               <w:br/>
+            </w:r>
+            <w:r>
+              <w:rPr>
+                <w:rFonts w:ascii="Consolas" w:hAnsi="Consolas"/>
+                <w:b w:val="0"/>
+                <w:sz w:val="17"/>
+              </w:rPr>
               <w:t>===============================================================</w:t>
               <w:br/>
+            </w:r>
+            <w:r>
+              <w:rPr>
+                <w:rFonts w:ascii="Consolas" w:hAnsi="Consolas"/>
+                <w:b w:val="0"/>
+                <w:sz w:val="17"/>
+              </w:rPr>
               <w:t>Total Jobs Run     : 2 Jobs (Lint &amp; Test)</w:t>
               <w:br/>
+            </w:r>
+            <w:r>
+              <w:rPr>
+                <w:rFonts w:ascii="Consolas" w:hAnsi="Consolas"/>
+                <w:b w:val="0"/>
+                <w:sz w:val="17"/>
+              </w:rPr>
               <w:t>Matrix Environments: Node.js 20.x (ubuntu-latest)</w:t>
               <w:br/>
+            </w:r>
+            <w:r>
+              <w:rPr>
+                <w:rFonts w:ascii="Consolas" w:hAnsi="Consolas"/>
+                <w:b w:val="0"/>
+                <w:sz w:val="17"/>
+              </w:rPr>
               <w:t>Average Run Time   : 47 seconds (with npm cache hit)</w:t>
               <w:br/>
+            </w:r>
+            <w:r>
+              <w:rPr>
+                <w:rFonts w:ascii="Consolas" w:hAnsi="Consolas"/>
+                <w:b w:val="0"/>
+                <w:sz w:val="17"/>
+              </w:rPr>
               <w:t>README Badge Status: Passing (Green)</w:t>
               <w:br/>
+            </w:r>
+            <w:r>
+              <w:rPr>
+                <w:rFonts w:ascii="Consolas" w:hAnsi="Consolas"/>
+                <w:b w:val="0"/>
+                <w:sz w:val="17"/>
+              </w:rPr>
               <w:t>===============================================================</w:t>
               <w:br/>
-              <w:br/>
+            </w:r>
+            <w:r>
+              <w:rPr>
+                <w:rFonts w:ascii="Consolas" w:hAnsi="Consolas"/>
+                <w:b w:val="0"/>
+                <w:sz w:val="17"/>
+              </w:rPr>
+              <w:br/>
+            </w:r>
+            <w:r>
+              <w:rPr>
+                <w:rFonts w:ascii="Consolas" w:hAnsi="Consolas"/>
+                <w:b w:val="0"/>
+                <w:sz w:val="17"/>
+              </w:rPr>
               <w:t>Test Results Summary: 6 / 6 Test Cases Passed (100%)</w:t>
-            </w:r>
-            <w:r>
-              <w:rPr>
-                <w:rFonts w:ascii="Consolas" w:hAnsi="Consolas"/>
-                <w:b w:val="0"/>
-                <w:sz w:val="17"/>
-              </w:rPr>
-            </w:r>
-            <w:r>
-              <w:rPr>
-                <w:rFonts w:ascii="Consolas" w:hAnsi="Consolas"/>
-                <w:b w:val="0"/>
-                <w:sz w:val="17"/>
-              </w:rPr>
-            </w:r>
-            <w:r>
-              <w:rPr>
-                <w:rFonts w:ascii="Consolas" w:hAnsi="Consolas"/>
-                <w:b w:val="0"/>
-                <w:sz w:val="17"/>
-              </w:rPr>
-            </w:r>
-            <w:r>
-              <w:rPr>
-                <w:rFonts w:ascii="Consolas" w:hAnsi="Consolas"/>
-                <w:b w:val="0"/>
-                <w:sz w:val="17"/>
-              </w:rPr>
-            </w:r>
-            <w:r>
-              <w:rPr>
-                <w:rFonts w:ascii="Consolas" w:hAnsi="Consolas"/>
-                <w:b w:val="0"/>
-                <w:sz w:val="17"/>
-              </w:rPr>
-            </w:r>
-            <w:r>
-              <w:rPr>
-                <w:rFonts w:ascii="Consolas" w:hAnsi="Consolas"/>
-                <w:b w:val="0"/>
-                <w:sz w:val="17"/>
-              </w:rPr>
-            </w:r>
-            <w:r>
-              <w:rPr>
-                <w:rFonts w:ascii="Consolas" w:hAnsi="Consolas"/>
-                <w:b w:val="0"/>
-                <w:sz w:val="17"/>
-              </w:rPr>
-            </w:r>
-            <w:r>
-              <w:rPr>
-                <w:rFonts w:ascii="Consolas" w:hAnsi="Consolas"/>
-                <w:b w:val="0"/>
-                <w:sz w:val="17"/>
-              </w:rPr>
-            </w:r>
-            <w:r>
-              <w:rPr>
-                <w:rFonts w:ascii="Consolas" w:hAnsi="Consolas"/>
-                <w:b w:val="0"/>
-                <w:sz w:val="17"/>
-              </w:rPr>
-            </w:r>
-            <w:r>
-              <w:rPr>
-                <w:rFonts w:ascii="Consolas" w:hAnsi="Consolas"/>
-                <w:b w:val="0"/>
-                <w:sz w:val="17"/>
-              </w:rPr>
-            </w:r>
-            <w:r>
-              <w:rPr>
-                <w:rFonts w:ascii="Consolas" w:hAnsi="Consolas"/>
-                <w:b w:val="0"/>
-                <w:sz w:val="17"/>
-              </w:rPr>
-            </w:r>
-            <w:r>
-              <w:rPr>
-                <w:rFonts w:ascii="Consolas" w:hAnsi="Consolas"/>
-                <w:b w:val="0"/>
-                <w:sz w:val="17"/>
-              </w:rPr>
-            </w:r>
-            <w:r>
-              <w:rPr>
-                <w:rFonts w:ascii="Consolas" w:hAnsi="Consolas"/>
-                <w:b w:val="0"/>
-                <w:sz w:val="17"/>
-              </w:rPr>
-            </w:r>
-            <w:r>
-              <w:rPr>
-                <w:rFonts w:ascii="Consolas" w:hAnsi="Consolas"/>
-                <w:b w:val="0"/>
-                <w:sz w:val="17"/>
-              </w:rPr>
-            </w:r>
-            <w:r>
-              <w:rPr>
-                <w:rFonts w:ascii="Consolas" w:hAnsi="Consolas"/>
-                <w:b w:val="0"/>
-                <w:sz w:val="17"/>
-              </w:rPr>
-            </w:r>
-            <w:r>
-              <w:rPr>
-                <w:rFonts w:ascii="Consolas" w:hAnsi="Consolas"/>
-                <w:b w:val="0"/>
-                <w:sz w:val="17"/>
-              </w:rPr>
-            </w:r>
-            <w:r>
-              <w:rPr>
-                <w:rFonts w:ascii="Consolas" w:hAnsi="Consolas"/>
-                <w:b w:val="0"/>
-                <w:sz w:val="17"/>
-              </w:rPr>
-            </w:r>
-            <w:r>
-              <w:rPr>
-                <w:rFonts w:ascii="Consolas" w:hAnsi="Consolas"/>
-                <w:b w:val="0"/>
-                <w:sz w:val="17"/>
-              </w:rPr>
-            </w:r>
-            <w:r>
-              <w:rPr>
-                <w:rFonts w:ascii="Consolas" w:hAnsi="Consolas"/>
-                <w:b w:val="0"/>
-                <w:sz w:val="17"/>
-              </w:rPr>
-            </w:r>
-            <w:r>
-              <w:rPr>
-                <w:rFonts w:ascii="Consolas" w:hAnsi="Consolas"/>
-                <w:b w:val="0"/>
-                <w:sz w:val="17"/>
-              </w:rPr>
-            </w:r>
-            <w:r>
-              <w:rPr>
-                <w:rFonts w:ascii="Consolas" w:hAnsi="Consolas"/>
-                <w:b w:val="0"/>
-                <w:sz w:val="17"/>
-              </w:rPr>
-            </w:r>
-            <w:r>
-              <w:rPr>
-                <w:rFonts w:ascii="Consolas" w:hAnsi="Consolas"/>
-                <w:b w:val="0"/>
-                <w:sz w:val="17"/>
-              </w:rPr>
-            </w:r>
-            <w:r>
-              <w:rPr>
-                <w:rFonts w:ascii="Consolas" w:hAnsi="Consolas"/>
-                <w:b w:val="0"/>
-                <w:sz w:val="17"/>
-              </w:rPr>
-            </w:r>
-            <w:r>
-              <w:rPr>
-                <w:rFonts w:ascii="Consolas" w:hAnsi="Consolas"/>
-                <w:b w:val="0"/>
-                <w:sz w:val="17"/>
-              </w:rPr>
-            </w:r>
-            <w:r>
-              <w:rPr>
-                <w:rFonts w:ascii="Consolas" w:hAnsi="Consolas"/>
-                <w:b w:val="0"/>
-                <w:sz w:val="17"/>
-              </w:rPr>
-            </w:r>
-            <w:r>
-              <w:rPr>
-                <w:rFonts w:ascii="Consolas" w:hAnsi="Consolas"/>
-                <w:b w:val="0"/>
-                <w:sz w:val="17"/>
-              </w:rPr>
-            </w:r>
-            <w:r>
-              <w:rPr>
-                <w:rFonts w:ascii="Consolas" w:hAnsi="Consolas"/>
-                <w:b w:val="0"/>
-                <w:sz w:val="17"/>
-              </w:rPr>
-            </w:r>
-            <w:r>
-              <w:rPr>
-                <w:rFonts w:ascii="Consolas" w:hAnsi="Consolas"/>
-                <w:b w:val="0"/>
-                <w:sz w:val="17"/>
-              </w:rPr>
-            </w:r>
-            <w:r>
-              <w:rPr>
-                <w:rFonts w:ascii="Consolas" w:hAnsi="Consolas"/>
-                <w:b w:val="0"/>
-                <w:sz w:val="17"/>
-              </w:rPr>
-            </w:r>
-            <w:r>
-              <w:rPr>
-                <w:rFonts w:ascii="Consolas" w:hAnsi="Consolas"/>
-                <w:b w:val="0"/>
-                <w:sz w:val="17"/>
-              </w:rPr>
-            </w:r>
-            <w:r>
-              <w:rPr>
-                <w:rFonts w:ascii="Consolas" w:hAnsi="Consolas"/>
-                <w:b w:val="0"/>
-                <w:sz w:val="17"/>
-              </w:rPr>
-            </w:r>
-            <w:r>
-              <w:rPr>
-                <w:rFonts w:ascii="Consolas" w:hAnsi="Consolas"/>
-                <w:b w:val="0"/>
-                <w:sz w:val="17"/>
-              </w:rPr>
-            </w:r>
-            <w:r>
-              <w:rPr>
-                <w:rFonts w:ascii="Consolas" w:hAnsi="Consolas"/>
-                <w:b w:val="0"/>
-                <w:sz w:val="17"/>
-              </w:rPr>
-            </w:r>
-            <w:r>
-              <w:rPr>
-                <w:rFonts w:ascii="Consolas" w:hAnsi="Consolas"/>
-                <w:b w:val="0"/>
-                <w:sz w:val="17"/>
-              </w:rPr>
-            </w:r>
-            <w:r>
-              <w:rPr>
-                <w:rFonts w:ascii="Consolas" w:hAnsi="Consolas"/>
-                <w:b w:val="0"/>
-                <w:sz w:val="17"/>
-              </w:rPr>
-            </w:r>
-            <w:r>
-              <w:rPr>
-                <w:rFonts w:ascii="Consolas" w:hAnsi="Consolas"/>
-                <w:b w:val="0"/>
-                <w:sz w:val="17"/>
-              </w:rPr>
-            </w:r>
-            <w:r>
-              <w:rPr>
-                <w:rFonts w:ascii="Consolas" w:hAnsi="Consolas"/>
-                <w:b w:val="0"/>
-                <w:sz w:val="17"/>
-              </w:rPr>
-            </w:r>
-            <w:r>
-              <w:rPr>
-                <w:rFonts w:ascii="Consolas" w:hAnsi="Consolas"/>
-                <w:b w:val="0"/>
-                <w:sz w:val="17"/>
-              </w:rPr>
-            </w:r>
-            <w:r>
-              <w:rPr>
-                <w:rFonts w:ascii="Consolas" w:hAnsi="Consolas"/>
-                <w:b w:val="0"/>
-                <w:sz w:val="17"/>
-              </w:rPr>
-            </w:r>
-            <w:r>
-              <w:rPr>
-                <w:rFonts w:ascii="Consolas" w:hAnsi="Consolas"/>
-                <w:b w:val="0"/>
-                <w:sz w:val="17"/>
-              </w:rPr>
-            </w:r>
-            <w:r>
-              <w:rPr>
-                <w:rFonts w:ascii="Consolas" w:hAnsi="Consolas"/>
-                <w:b w:val="0"/>
-                <w:sz w:val="17"/>
-              </w:rPr>
-            </w:r>
-            <w:r>
-              <w:rPr>
-                <w:rFonts w:ascii="Consolas" w:hAnsi="Consolas"/>
-                <w:b w:val="0"/>
-                <w:sz w:val="17"/>
-              </w:rPr>
             </w:r>
           </w:p>
         </w:tc>
@@ -1590,7 +1590,7 @@
         <w:pStyle w:val="2"/>
       </w:pPr>
       <w:r>
-        <w:t>Student Information</w:t>
+        <w:t>Academic Details</w:t>
       </w:r>
     </w:p>
     <w:p>
@@ -1600,7 +1600,7 @@
     </w:p>
     <w:p>
       <w:r>
-        <w:t>ID: 24CS091</w:t>
+        <w:t>Student ID: 24CS091</w:t>
       </w:r>
     </w:p>
     <w:p>

</xml_diff>